<commit_message>
Strengthen V-Trans PTL way forward with diagnosis map and 90-day plan
Add a diagnosis-to-action ownership map and a 30/60/90-day execution plan so the opportunity note converts into an operable improvement agenda.

Co-authored-by: AviralBD <AviralBD@users.noreply.github.com>
</commit_message>
<xml_diff>
--- a/vtrans_ptl_improvement/VTrans_PTL_Way_Forward_for_Improvement.docx
+++ b/vtrans_ptl_improvement/VTrans_PTL_Way_Forward_for_Improvement.docx
@@ -13,33 +13,36 @@
           <w:b/>
           <w:i w:val="0"/>
           <w:color w:val="1B365D"/>
-          <w:sz w:val="40"/>
+          <w:sz w:val="44"/>
         </w:rPr>
         <w:t>Way Forward for Improvement</w:t>
       </w:r>
     </w:p>
     <w:p>
       <w:pPr>
-        <w:spacing w:after="160"/>
+        <w:spacing w:after="120" w:before="0"/>
       </w:pPr>
       <w:r>
         <w:rPr>
           <w:rFonts w:ascii="Calibri" w:hAnsi="Calibri" w:eastAsia="Calibri"/>
           <w:b/>
           <w:i w:val="0"/>
-          <w:color w:val="0F6C8C"/>
-          <w:sz w:val="24"/>
+          <w:color w:val="1A2332"/>
+          <w:sz w:val="26"/>
         </w:rPr>
         <w:t>Unlocking V-Trans PTL Share in a Large Untapped Market</w:t>
       </w:r>
     </w:p>
     <w:p>
+      <w:pPr>
+        <w:spacing w:after="120" w:before="0"/>
+      </w:pPr>
       <w:r>
         <w:rPr>
           <w:rFonts w:ascii="Calibri" w:hAnsi="Calibri" w:eastAsia="Calibri"/>
           <w:b w:val="0"/>
           <w:i/>
-          <w:color w:val="5B6B7C"/>
+          <w:color w:val="1A2332"/>
           <w:sz w:val="20"/>
         </w:rPr>
         <w:t>Prepared from the diagnosis in “Large Untapped Market Opportunity.”</w:t>
@@ -62,7 +65,7 @@
     </w:p>
     <w:p>
       <w:pPr>
-        <w:spacing w:after="120" w:line="276" w:lineRule="auto"/>
+        <w:spacing w:after="120" w:before="0"/>
       </w:pPr>
       <w:r>
         <w:rPr>
@@ -77,7 +80,7 @@
     </w:p>
     <w:p>
       <w:pPr>
-        <w:spacing w:after="120" w:line="276" w:lineRule="auto"/>
+        <w:spacing w:after="120" w:before="0"/>
       </w:pPr>
       <w:r>
         <w:rPr>
@@ -87,7 +90,7 @@
           <w:color w:val="1A2332"/>
           <w:sz w:val="22"/>
         </w:rPr>
-        <w:t>Growth is constrained by five reinforcing gaps: weak new-customer conversion; low share of wallet from existing accounts; sales time lost to operations; weak CRM/follow-up; and service performance (OTD ~55–60% vs desired 85%) amplified by warehouse and connectivity issues. In several branches/franchisees, FTL is used to bridge targets while PTL growth stays thin.</w:t>
+        <w:t>Growth is constrained by five reinforcing gaps: weak new-customer conversion; low share of wallet from existing accounts; sales time lost to operations; weak CRM/follow-up; and service performance (OTD ~55–60% vs desired 85%) amplified by warehouse and connectivity issues. In several branches/franchisees (e.g. Shiroli, Satara), FTL is used to bridge targets while PTL growth stays thin.</w:t>
       </w:r>
     </w:p>
     <w:p>
@@ -107,12 +110,12 @@
     </w:p>
     <w:p>
       <w:pPr>
-        <w:spacing w:after="120" w:line="276" w:lineRule="auto"/>
+        <w:spacing w:after="120" w:before="0"/>
       </w:pPr>
       <w:r>
         <w:rPr>
           <w:rFonts w:ascii="Calibri" w:hAnsi="Calibri" w:eastAsia="Calibri"/>
-          <w:b w:val="0"/>
+          <w:b/>
           <w:i w:val="0"/>
           <w:color w:val="1A2332"/>
           <w:sz w:val="22"/>
@@ -122,7 +125,7 @@
     </w:p>
     <w:p>
       <w:pPr>
-        <w:spacing w:after="120" w:line="276" w:lineRule="auto"/>
+        <w:spacing w:after="120" w:before="0"/>
       </w:pPr>
       <w:r>
         <w:rPr>
@@ -147,12 +150,618 @@
           <w:color w:val="1B365D"/>
           <w:sz w:val="28"/>
         </w:rPr>
-        <w:t>3. Pillar 1 — Fix service performance (non-negotiable growth enabler)</w:t>
+        <w:t>3. Diagnosis → way-forward map</w:t>
       </w:r>
     </w:p>
     <w:p>
       <w:pPr>
-        <w:spacing w:after="120" w:line="276" w:lineRule="auto"/>
+        <w:spacing w:after="120" w:before="0"/>
+      </w:pPr>
+      <w:r>
+        <w:rPr>
+          <w:rFonts w:ascii="Calibri" w:hAnsi="Calibri" w:eastAsia="Calibri"/>
+          <w:b w:val="0"/>
+          <w:i/>
+          <w:color w:val="1A2332"/>
+          <w:sz w:val="22"/>
+        </w:rPr>
+        <w:t>Every improvement action below is mapped to a specific gap called out in the opportunity note.</w:t>
+      </w:r>
+    </w:p>
+    <w:tbl>
+      <w:tblPr>
+        <w:tblStyle w:val="TableGrid"/>
+        <w:tblW w:type="auto" w:w="0"/>
+        <w:tblLook w:firstColumn="1" w:firstRow="1" w:lastColumn="0" w:lastRow="0" w:noHBand="0" w:noVBand="1" w:val="04A0"/>
+      </w:tblPr>
+      <w:tblGrid>
+        <w:gridCol w:w="3264"/>
+        <w:gridCol w:w="3264"/>
+        <w:gridCol w:w="3264"/>
+      </w:tblGrid>
+      <w:tr>
+        <w:tc>
+          <w:tcPr>
+            <w:tcW w:type="dxa" w:w="3264"/>
+            <w:shd w:fill="1B365D" w:val="clear"/>
+          </w:tcPr>
+          <w:p>
+            <w:r/>
+            <w:r>
+              <w:rPr>
+                <w:rFonts w:ascii="Calibri" w:hAnsi="Calibri" w:eastAsia="Calibri"/>
+                <w:b/>
+                <w:i w:val="0"/>
+                <w:color w:val="FFFFFF"/>
+                <w:sz w:val="20"/>
+              </w:rPr>
+              <w:t>Diagnosis input</w:t>
+            </w:r>
+          </w:p>
+        </w:tc>
+        <w:tc>
+          <w:tcPr>
+            <w:tcW w:type="dxa" w:w="3264"/>
+            <w:shd w:fill="1B365D" w:val="clear"/>
+          </w:tcPr>
+          <w:p>
+            <w:r/>
+            <w:r>
+              <w:rPr>
+                <w:rFonts w:ascii="Calibri" w:hAnsi="Calibri" w:eastAsia="Calibri"/>
+                <w:b/>
+                <w:i w:val="0"/>
+                <w:color w:val="FFFFFF"/>
+                <w:sz w:val="20"/>
+              </w:rPr>
+              <w:t>Way-forward response</w:t>
+            </w:r>
+          </w:p>
+        </w:tc>
+        <w:tc>
+          <w:tcPr>
+            <w:tcW w:type="dxa" w:w="3264"/>
+            <w:shd w:fill="1B365D" w:val="clear"/>
+          </w:tcPr>
+          <w:p>
+            <w:r/>
+            <w:r>
+              <w:rPr>
+                <w:rFonts w:ascii="Calibri" w:hAnsi="Calibri" w:eastAsia="Calibri"/>
+                <w:b/>
+                <w:i w:val="0"/>
+                <w:color w:val="FFFFFF"/>
+                <w:sz w:val="20"/>
+              </w:rPr>
+              <w:t>Primary owner</w:t>
+            </w:r>
+          </w:p>
+        </w:tc>
+      </w:tr>
+      <w:tr>
+        <w:tc>
+          <w:tcPr>
+            <w:tcW w:type="dxa" w:w="3264"/>
+          </w:tcPr>
+          <w:p>
+            <w:r/>
+            <w:r>
+              <w:rPr>
+                <w:rFonts w:ascii="Calibri" w:hAnsi="Calibri" w:eastAsia="Calibri"/>
+                <w:b w:val="0"/>
+                <w:i w:val="0"/>
+                <w:color w:val="1A2332"/>
+                <w:sz w:val="20"/>
+              </w:rPr>
+              <w:t>OTD 55–60% vs desired 85%; high TAT, holding, last-mile delay, weak connectivity</w:t>
+            </w:r>
+          </w:p>
+        </w:tc>
+        <w:tc>
+          <w:tcPr>
+            <w:tcW w:type="dxa" w:w="3264"/>
+          </w:tcPr>
+          <w:p>
+            <w:r/>
+            <w:r>
+              <w:rPr>
+                <w:rFonts w:ascii="Calibri" w:hAnsi="Calibri" w:eastAsia="Calibri"/>
+                <w:b w:val="0"/>
+                <w:i w:val="0"/>
+                <w:color w:val="1A2332"/>
+                <w:sz w:val="20"/>
+              </w:rPr>
+              <w:t>Lane-level OTD ladder, cut-off/departure discipline, hub handoff SLAs, warehouse segregation</w:t>
+            </w:r>
+          </w:p>
+        </w:tc>
+        <w:tc>
+          <w:tcPr>
+            <w:tcW w:type="dxa" w:w="3264"/>
+          </w:tcPr>
+          <w:p>
+            <w:r/>
+            <w:r>
+              <w:rPr>
+                <w:rFonts w:ascii="Calibri" w:hAnsi="Calibri" w:eastAsia="Calibri"/>
+                <w:b w:val="0"/>
+                <w:i w:val="0"/>
+                <w:color w:val="1A2332"/>
+                <w:sz w:val="20"/>
+              </w:rPr>
+              <w:t>Operations / Hub lead</w:t>
+            </w:r>
+          </w:p>
+        </w:tc>
+      </w:tr>
+      <w:tr>
+        <w:tc>
+          <w:tcPr>
+            <w:tcW w:type="dxa" w:w="3264"/>
+          </w:tcPr>
+          <w:p>
+            <w:r/>
+            <w:r>
+              <w:rPr>
+                <w:rFonts w:ascii="Calibri" w:hAnsi="Calibri" w:eastAsia="Calibri"/>
+                <w:b w:val="0"/>
+                <w:i w:val="0"/>
+                <w:color w:val="1A2332"/>
+                <w:sz w:val="20"/>
+              </w:rPr>
+              <w:t>Warehouse gaps: mixed material, loading delay, visibility, transshipment</w:t>
+            </w:r>
+          </w:p>
+        </w:tc>
+        <w:tc>
+          <w:tcPr>
+            <w:tcW w:type="dxa" w:w="3264"/>
+          </w:tcPr>
+          <w:p>
+            <w:r/>
+            <w:r>
+              <w:rPr>
+                <w:rFonts w:ascii="Calibri" w:hAnsi="Calibri" w:eastAsia="Calibri"/>
+                <w:b w:val="0"/>
+                <w:i w:val="0"/>
+                <w:color w:val="1A2332"/>
+                <w:sz w:val="20"/>
+              </w:rPr>
+              <w:t>Branch ownership for segregation &amp; loading readiness; single visibility trail for held shipments</w:t>
+            </w:r>
+          </w:p>
+        </w:tc>
+        <w:tc>
+          <w:tcPr>
+            <w:tcW w:type="dxa" w:w="3264"/>
+          </w:tcPr>
+          <w:p>
+            <w:r/>
+            <w:r>
+              <w:rPr>
+                <w:rFonts w:ascii="Calibri" w:hAnsi="Calibri" w:eastAsia="Calibri"/>
+                <w:b w:val="0"/>
+                <w:i w:val="0"/>
+                <w:color w:val="1A2332"/>
+                <w:sz w:val="20"/>
+              </w:rPr>
+              <w:t>Branch ops + Hub</w:t>
+            </w:r>
+          </w:p>
+        </w:tc>
+      </w:tr>
+      <w:tr>
+        <w:tc>
+          <w:tcPr>
+            <w:tcW w:type="dxa" w:w="3264"/>
+          </w:tcPr>
+          <w:p>
+            <w:r/>
+            <w:r>
+              <w:rPr>
+                <w:rFonts w:ascii="Calibri" w:hAnsi="Calibri" w:eastAsia="Calibri"/>
+                <w:b w:val="0"/>
+                <w:i w:val="0"/>
+                <w:color w:val="1A2332"/>
+                <w:sz w:val="20"/>
+              </w:rPr>
+              <w:t>Competitor edge = service + network (ACPL, VRL, TCI, ARC, OM); price alone will not win</w:t>
+            </w:r>
+          </w:p>
+        </w:tc>
+        <w:tc>
+          <w:tcPr>
+            <w:tcW w:type="dxa" w:w="3264"/>
+          </w:tcPr>
+          <w:p>
+            <w:r/>
+            <w:r>
+              <w:rPr>
+                <w:rFonts w:ascii="Calibri" w:hAnsi="Calibri" w:eastAsia="Calibri"/>
+                <w:b w:val="0"/>
+                <w:i w:val="0"/>
+                <w:color w:val="1A2332"/>
+                <w:sz w:val="20"/>
+              </w:rPr>
+              <w:t>Sell reliability &amp; network fit; densify priority PTL lanes; publish service-promise pack to sales</w:t>
+            </w:r>
+          </w:p>
+        </w:tc>
+        <w:tc>
+          <w:tcPr>
+            <w:tcW w:type="dxa" w:w="3264"/>
+          </w:tcPr>
+          <w:p>
+            <w:r/>
+            <w:r>
+              <w:rPr>
+                <w:rFonts w:ascii="Calibri" w:hAnsi="Calibri" w:eastAsia="Calibri"/>
+                <w:b w:val="0"/>
+                <w:i w:val="0"/>
+                <w:color w:val="1A2332"/>
+                <w:sz w:val="20"/>
+              </w:rPr>
+              <w:t>Network + Sales</w:t>
+            </w:r>
+          </w:p>
+        </w:tc>
+      </w:tr>
+      <w:tr>
+        <w:tc>
+          <w:tcPr>
+            <w:tcW w:type="dxa" w:w="3264"/>
+          </w:tcPr>
+          <w:p>
+            <w:r/>
+            <w:r>
+              <w:rPr>
+                <w:rFonts w:ascii="Calibri" w:hAnsi="Calibri" w:eastAsia="Calibri"/>
+                <w:b w:val="0"/>
+                <w:i w:val="0"/>
+                <w:color w:val="1A2332"/>
+                <w:sz w:val="20"/>
+              </w:rPr>
+              <w:t>Reach ~1/6th of ACPL and &lt;½ of VRL; visits happen but conversion is low</w:t>
+            </w:r>
+          </w:p>
+        </w:tc>
+        <w:tc>
+          <w:tcPr>
+            <w:tcW w:type="dxa" w:w="3264"/>
+          </w:tcPr>
+          <w:p>
+            <w:r/>
+            <w:r>
+              <w:rPr>
+                <w:rFonts w:ascii="Calibri" w:hAnsi="Calibri" w:eastAsia="Calibri"/>
+                <w:b w:val="0"/>
+                <w:i w:val="0"/>
+                <w:color w:val="1A2332"/>
+                <w:sz w:val="20"/>
+              </w:rPr>
+              <w:t>Named prospect universe + visit→trial→contract funnel; hand-held first shipments</w:t>
+            </w:r>
+          </w:p>
+        </w:tc>
+        <w:tc>
+          <w:tcPr>
+            <w:tcW w:type="dxa" w:w="3264"/>
+          </w:tcPr>
+          <w:p>
+            <w:r/>
+            <w:r>
+              <w:rPr>
+                <w:rFonts w:ascii="Calibri" w:hAnsi="Calibri" w:eastAsia="Calibri"/>
+                <w:b w:val="0"/>
+                <w:i w:val="0"/>
+                <w:color w:val="1A2332"/>
+                <w:sz w:val="20"/>
+              </w:rPr>
+              <w:t>Sales / Branch manager</w:t>
+            </w:r>
+          </w:p>
+        </w:tc>
+      </w:tr>
+      <w:tr>
+        <w:tc>
+          <w:tcPr>
+            <w:tcW w:type="dxa" w:w="3264"/>
+          </w:tcPr>
+          <w:p>
+            <w:r/>
+            <w:r>
+              <w:rPr>
+                <w:rFonts w:ascii="Calibri" w:hAnsi="Calibri" w:eastAsia="Calibri"/>
+                <w:b w:val="0"/>
+                <w:i w:val="0"/>
+                <w:color w:val="1A2332"/>
+                <w:sz w:val="20"/>
+              </w:rPr>
+              <w:t>Existing customers give only 10–15% of freight</w:t>
+            </w:r>
+          </w:p>
+        </w:tc>
+        <w:tc>
+          <w:tcPr>
+            <w:tcW w:type="dxa" w:w="3264"/>
+          </w:tcPr>
+          <w:p>
+            <w:r/>
+            <w:r>
+              <w:rPr>
+                <w:rFonts w:ascii="Calibri" w:hAnsi="Calibri" w:eastAsia="Calibri"/>
+                <w:b w:val="0"/>
+                <w:i w:val="0"/>
+                <w:color w:val="1A2332"/>
+                <w:sz w:val="20"/>
+              </w:rPr>
+              <w:t>Share-of-wallet mapping + top-account growth plans + structured BIC cadence</w:t>
+            </w:r>
+          </w:p>
+        </w:tc>
+        <w:tc>
+          <w:tcPr>
+            <w:tcW w:type="dxa" w:w="3264"/>
+          </w:tcPr>
+          <w:p>
+            <w:r/>
+            <w:r>
+              <w:rPr>
+                <w:rFonts w:ascii="Calibri" w:hAnsi="Calibri" w:eastAsia="Calibri"/>
+                <w:b w:val="0"/>
+                <w:i w:val="0"/>
+                <w:color w:val="1A2332"/>
+                <w:sz w:val="20"/>
+              </w:rPr>
+              <w:t>Key account / BIC</w:t>
+            </w:r>
+          </w:p>
+        </w:tc>
+      </w:tr>
+      <w:tr>
+        <w:tc>
+          <w:tcPr>
+            <w:tcW w:type="dxa" w:w="3264"/>
+          </w:tcPr>
+          <w:p>
+            <w:r/>
+            <w:r>
+              <w:rPr>
+                <w:rFonts w:ascii="Calibri" w:hAnsi="Calibri" w:eastAsia="Calibri"/>
+                <w:b w:val="0"/>
+                <w:i w:val="0"/>
+                <w:color w:val="1A2332"/>
+                <w:sz w:val="20"/>
+              </w:rPr>
+              <w:t>BM &amp; sales distracted by booking/loading/unloading</w:t>
+            </w:r>
+          </w:p>
+        </w:tc>
+        <w:tc>
+          <w:tcPr>
+            <w:tcW w:type="dxa" w:w="3264"/>
+          </w:tcPr>
+          <w:p>
+            <w:r/>
+            <w:r>
+              <w:rPr>
+                <w:rFonts w:ascii="Calibri" w:hAnsi="Calibri" w:eastAsia="Calibri"/>
+                <w:b w:val="0"/>
+                <w:i w:val="0"/>
+                <w:color w:val="1A2332"/>
+                <w:sz w:val="20"/>
+              </w:rPr>
+              <w:t>Ring-fence sales hours; ops backfill at high-volume branches</w:t>
+            </w:r>
+          </w:p>
+        </w:tc>
+        <w:tc>
+          <w:tcPr>
+            <w:tcW w:type="dxa" w:w="3264"/>
+          </w:tcPr>
+          <w:p>
+            <w:r/>
+            <w:r>
+              <w:rPr>
+                <w:rFonts w:ascii="Calibri" w:hAnsi="Calibri" w:eastAsia="Calibri"/>
+                <w:b w:val="0"/>
+                <w:i w:val="0"/>
+                <w:color w:val="1A2332"/>
+                <w:sz w:val="20"/>
+              </w:rPr>
+              <w:t>Regional head</w:t>
+            </w:r>
+          </w:p>
+        </w:tc>
+      </w:tr>
+      <w:tr>
+        <w:tc>
+          <w:tcPr>
+            <w:tcW w:type="dxa" w:w="3264"/>
+          </w:tcPr>
+          <w:p>
+            <w:r/>
+            <w:r>
+              <w:rPr>
+                <w:rFonts w:ascii="Calibri" w:hAnsi="Calibri" w:eastAsia="Calibri"/>
+                <w:b w:val="0"/>
+                <w:i w:val="0"/>
+                <w:color w:val="1A2332"/>
+                <w:sz w:val="20"/>
+              </w:rPr>
+              <w:t>Franchisees rely on relationship customers; salespersons weak on new logos</w:t>
+            </w:r>
+          </w:p>
+        </w:tc>
+        <w:tc>
+          <w:tcPr>
+            <w:tcW w:type="dxa" w:w="3264"/>
+          </w:tcPr>
+          <w:p>
+            <w:r/>
+            <w:r>
+              <w:rPr>
+                <w:rFonts w:ascii="Calibri" w:hAnsi="Calibri" w:eastAsia="Calibri"/>
+                <w:b w:val="0"/>
+                <w:i w:val="0"/>
+                <w:color w:val="1A2332"/>
+                <w:sz w:val="20"/>
+              </w:rPr>
+              <w:t>Franchise rule: owners hold relationships; sales own new-logo &amp; SOW targets</w:t>
+            </w:r>
+          </w:p>
+        </w:tc>
+        <w:tc>
+          <w:tcPr>
+            <w:tcW w:type="dxa" w:w="3264"/>
+          </w:tcPr>
+          <w:p>
+            <w:r/>
+            <w:r>
+              <w:rPr>
+                <w:rFonts w:ascii="Calibri" w:hAnsi="Calibri" w:eastAsia="Calibri"/>
+                <w:b w:val="0"/>
+                <w:i w:val="0"/>
+                <w:color w:val="1A2332"/>
+                <w:sz w:val="20"/>
+              </w:rPr>
+              <w:t>Franchise + Sales</w:t>
+            </w:r>
+          </w:p>
+        </w:tc>
+      </w:tr>
+      <w:tr>
+        <w:tc>
+          <w:tcPr>
+            <w:tcW w:type="dxa" w:w="3264"/>
+          </w:tcPr>
+          <w:p>
+            <w:r/>
+            <w:r>
+              <w:rPr>
+                <w:rFonts w:ascii="Calibri" w:hAnsi="Calibri" w:eastAsia="Calibri"/>
+                <w:b w:val="0"/>
+                <w:i w:val="0"/>
+                <w:color w:val="1A2332"/>
+                <w:sz w:val="20"/>
+              </w:rPr>
+              <w:t>Weak CRM: delayed response, poor BIC, limited POD/LR sharing</w:t>
+            </w:r>
+          </w:p>
+        </w:tc>
+        <w:tc>
+          <w:tcPr>
+            <w:tcW w:type="dxa" w:w="3264"/>
+          </w:tcPr>
+          <w:p>
+            <w:r/>
+            <w:r>
+              <w:rPr>
+                <w:rFonts w:ascii="Calibri" w:hAnsi="Calibri" w:eastAsia="Calibri"/>
+                <w:b w:val="0"/>
+                <w:i w:val="0"/>
+                <w:color w:val="1A2332"/>
+                <w:sz w:val="20"/>
+              </w:rPr>
+              <w:t>Mandatory CRM hygiene, response SLA, standard POD/LR &amp; exception alerts</w:t>
+            </w:r>
+          </w:p>
+        </w:tc>
+        <w:tc>
+          <w:tcPr>
+            <w:tcW w:type="dxa" w:w="3264"/>
+          </w:tcPr>
+          <w:p>
+            <w:r/>
+            <w:r>
+              <w:rPr>
+                <w:rFonts w:ascii="Calibri" w:hAnsi="Calibri" w:eastAsia="Calibri"/>
+                <w:b w:val="0"/>
+                <w:i w:val="0"/>
+                <w:color w:val="1A2332"/>
+                <w:sz w:val="20"/>
+              </w:rPr>
+              <w:t>CRM / Customer care</w:t>
+            </w:r>
+          </w:p>
+        </w:tc>
+      </w:tr>
+      <w:tr>
+        <w:tc>
+          <w:tcPr>
+            <w:tcW w:type="dxa" w:w="3264"/>
+          </w:tcPr>
+          <w:p>
+            <w:r/>
+            <w:r>
+              <w:rPr>
+                <w:rFonts w:ascii="Calibri" w:hAnsi="Calibri" w:eastAsia="Calibri"/>
+                <w:b w:val="0"/>
+                <w:i w:val="0"/>
+                <w:color w:val="1A2332"/>
+                <w:sz w:val="20"/>
+              </w:rPr>
+              <w:t>FTL used to bridge targets (Shiroli, Satara); PTL growth limited</w:t>
+            </w:r>
+          </w:p>
+        </w:tc>
+        <w:tc>
+          <w:tcPr>
+            <w:tcW w:type="dxa" w:w="3264"/>
+          </w:tcPr>
+          <w:p>
+            <w:r/>
+            <w:r>
+              <w:rPr>
+                <w:rFonts w:ascii="Calibri" w:hAnsi="Calibri" w:eastAsia="Calibri"/>
+                <w:b w:val="0"/>
+                <w:i w:val="0"/>
+                <w:color w:val="1A2332"/>
+                <w:sz w:val="20"/>
+              </w:rPr>
+              <w:t>Separate PTL vs FTL scorecards; PTL growth visible even if overall MT is met via FTL</w:t>
+            </w:r>
+          </w:p>
+        </w:tc>
+        <w:tc>
+          <w:tcPr>
+            <w:tcW w:type="dxa" w:w="3264"/>
+          </w:tcPr>
+          <w:p>
+            <w:r/>
+            <w:r>
+              <w:rPr>
+                <w:rFonts w:ascii="Calibri" w:hAnsi="Calibri" w:eastAsia="Calibri"/>
+                <w:b w:val="0"/>
+                <w:i w:val="0"/>
+                <w:color w:val="1A2332"/>
+                <w:sz w:val="20"/>
+              </w:rPr>
+              <w:t>Leadership / Region</w:t>
+            </w:r>
+          </w:p>
+        </w:tc>
+      </w:tr>
+    </w:tbl>
+    <w:p/>
+    <w:p>
+      <w:pPr>
+        <w:spacing w:before="280" w:after="120"/>
+      </w:pPr>
+      <w:r>
+        <w:rPr>
+          <w:rFonts w:ascii="Calibri" w:hAnsi="Calibri" w:eastAsia="Calibri"/>
+          <w:b/>
+          <w:i w:val="0"/>
+          <w:color w:val="1B365D"/>
+          <w:sz w:val="28"/>
+        </w:rPr>
+        <w:t>4. Pillar 1 — Fix service performance (non-negotiable growth enabler)</w:t>
+      </w:r>
+    </w:p>
+    <w:p>
+      <w:pPr>
+        <w:spacing w:after="120" w:before="0"/>
       </w:pPr>
       <w:r>
         <w:rPr>
@@ -167,15 +776,15 @@
     </w:p>
     <w:p>
       <w:pPr>
-        <w:spacing w:before="200" w:after="80"/>
+        <w:spacing w:after="120" w:before="0"/>
       </w:pPr>
       <w:r>
         <w:rPr>
           <w:rFonts w:ascii="Calibri" w:hAnsi="Calibri" w:eastAsia="Calibri"/>
           <w:b/>
           <w:i w:val="0"/>
-          <w:color w:val="0F6C8C"/>
-          <w:sz w:val="24"/>
+          <w:color w:val="1A2332"/>
+          <w:sz w:val="22"/>
         </w:rPr>
         <w:t>Actions</w:t>
       </w:r>
@@ -262,33 +871,17 @@
     </w:p>
     <w:p>
       <w:pPr>
-        <w:spacing w:after="120" w:line="276" w:lineRule="auto"/>
+        <w:spacing w:after="120" w:before="0"/>
       </w:pPr>
       <w:r>
         <w:rPr>
           <w:rFonts w:ascii="Calibri" w:hAnsi="Calibri" w:eastAsia="Calibri"/>
           <w:b w:val="0"/>
-          <w:i w:val="0"/>
+          <w:i/>
           <w:color w:val="1A2332"/>
           <w:sz w:val="22"/>
         </w:rPr>
-        <w:t xml:space="preserve">Immediate KPIs: </w:t>
-      </w:r>
-    </w:p>
-    <w:p>
-      <w:pPr>
-        <w:pStyle w:val="ListBullet"/>
-        <w:spacing w:after="60"/>
-      </w:pPr>
-      <w:r>
-        <w:rPr>
-          <w:rFonts w:ascii="Calibri" w:hAnsi="Calibri" w:eastAsia="Calibri"/>
-          <w:b w:val="0"/>
-          <w:i w:val="0"/>
-          <w:color w:val="1A2332"/>
-          <w:sz w:val="22"/>
-        </w:rPr>
-        <w:t>OTD %, average TAT, shipments held &gt;X hours, last-mile delay rate, delay-related complaints/claims.</w:t>
+        <w:t>Immediate KPIs: OTD %, average TAT, shipments held &gt;X hours, last-mile delay rate, delay-related complaints/claims.</w:t>
       </w:r>
     </w:p>
     <w:p>
@@ -303,12 +896,12 @@
           <w:color w:val="1B365D"/>
           <w:sz w:val="28"/>
         </w:rPr>
-        <w:t>4. Pillar 2 — Separate sales effort from branch operations</w:t>
+        <w:t>5. Pillar 2 — Separate sales effort from branch operations</w:t>
       </w:r>
     </w:p>
     <w:p>
       <w:pPr>
-        <w:spacing w:after="120" w:line="276" w:lineRule="auto"/>
+        <w:spacing w:after="120" w:before="0"/>
       </w:pPr>
       <w:r>
         <w:rPr>
@@ -323,15 +916,15 @@
     </w:p>
     <w:p>
       <w:pPr>
-        <w:spacing w:before="200" w:after="80"/>
+        <w:spacing w:after="120" w:before="0"/>
       </w:pPr>
       <w:r>
         <w:rPr>
           <w:rFonts w:ascii="Calibri" w:hAnsi="Calibri" w:eastAsia="Calibri"/>
           <w:b/>
           <w:i w:val="0"/>
-          <w:color w:val="0F6C8C"/>
-          <w:sz w:val="24"/>
+          <w:color w:val="1A2332"/>
+          <w:sz w:val="22"/>
         </w:rPr>
         <w:t>Actions</w:t>
       </w:r>
@@ -402,18 +995,17 @@
     </w:p>
     <w:p>
       <w:pPr>
-        <w:pStyle w:val="ListBullet"/>
-        <w:spacing w:after="60"/>
+        <w:spacing w:after="120" w:before="0"/>
       </w:pPr>
       <w:r>
         <w:rPr>
           <w:rFonts w:ascii="Calibri" w:hAnsi="Calibri" w:eastAsia="Calibri"/>
           <w:b w:val="0"/>
-          <w:i w:val="0"/>
+          <w:i/>
           <w:color w:val="1A2332"/>
           <w:sz w:val="22"/>
         </w:rPr>
-        <w:t>Immediate KPIs: productive sales hours/week, visits completed, new accounts opened, PTL vs FTL mix vs target.</w:t>
+        <w:t>Immediate KPIs: Productive sales hours / week, visits completed, new accounts opened, PTL vs FTL mix vs target.</w:t>
       </w:r>
     </w:p>
     <w:p>
@@ -428,12 +1020,12 @@
           <w:color w:val="1B365D"/>
           <w:sz w:val="28"/>
         </w:rPr>
-        <w:t>5. Pillar 3 — Rebuild new-customer development and conversion</w:t>
+        <w:t>6. Pillar 3 — Rebuild new-customer development and conversion</w:t>
       </w:r>
     </w:p>
     <w:p>
       <w:pPr>
-        <w:spacing w:after="120" w:line="276" w:lineRule="auto"/>
+        <w:spacing w:after="120" w:before="0"/>
       </w:pPr>
       <w:r>
         <w:rPr>
@@ -448,15 +1040,15 @@
     </w:p>
     <w:p>
       <w:pPr>
-        <w:spacing w:before="200" w:after="80"/>
+        <w:spacing w:after="120" w:before="0"/>
       </w:pPr>
       <w:r>
         <w:rPr>
           <w:rFonts w:ascii="Calibri" w:hAnsi="Calibri" w:eastAsia="Calibri"/>
           <w:b/>
           <w:i w:val="0"/>
-          <w:color w:val="0F6C8C"/>
-          <w:sz w:val="24"/>
+          <w:color w:val="1A2332"/>
+          <w:sz w:val="22"/>
         </w:rPr>
         <w:t>Actions</w:t>
       </w:r>
@@ -543,18 +1135,17 @@
     </w:p>
     <w:p>
       <w:pPr>
-        <w:pStyle w:val="ListBullet"/>
-        <w:spacing w:after="60"/>
+        <w:spacing w:after="120" w:before="0"/>
       </w:pPr>
       <w:r>
         <w:rPr>
           <w:rFonts w:ascii="Calibri" w:hAnsi="Calibri" w:eastAsia="Calibri"/>
           <w:b w:val="0"/>
-          <w:i w:val="0"/>
+          <w:i/>
           <w:color w:val="1A2332"/>
           <w:sz w:val="22"/>
         </w:rPr>
-        <w:t>Immediate KPIs: prospects in pipeline, visit-to-trial %, trial-to-contract %, new PTL MT from new logos, reach vs competitor baseline.</w:t>
+        <w:t>Immediate KPIs: Prospects in pipeline, visit-to-trial %, trial-to-contract %, new PTL MT from new logos, reach vs competitor baseline.</w:t>
       </w:r>
     </w:p>
     <w:p>
@@ -569,12 +1160,12 @@
           <w:color w:val="1B365D"/>
           <w:sz w:val="28"/>
         </w:rPr>
-        <w:t>6. Pillar 4 — Expand share of wallet with existing customers</w:t>
+        <w:t>7. Pillar 4 — Expand share of wallet with existing customers</w:t>
       </w:r>
     </w:p>
     <w:p>
       <w:pPr>
-        <w:spacing w:after="120" w:line="276" w:lineRule="auto"/>
+        <w:spacing w:after="120" w:before="0"/>
       </w:pPr>
       <w:r>
         <w:rPr>
@@ -589,15 +1180,15 @@
     </w:p>
     <w:p>
       <w:pPr>
-        <w:spacing w:before="200" w:after="80"/>
+        <w:spacing w:after="120" w:before="0"/>
       </w:pPr>
       <w:r>
         <w:rPr>
           <w:rFonts w:ascii="Calibri" w:hAnsi="Calibri" w:eastAsia="Calibri"/>
           <w:b/>
           <w:i w:val="0"/>
-          <w:color w:val="0F6C8C"/>
-          <w:sz w:val="24"/>
+          <w:color w:val="1A2332"/>
+          <w:sz w:val="22"/>
         </w:rPr>
         <w:t>Actions</w:t>
       </w:r>
@@ -684,18 +1275,17 @@
     </w:p>
     <w:p>
       <w:pPr>
-        <w:pStyle w:val="ListBullet"/>
-        <w:spacing w:after="60"/>
+        <w:spacing w:after="120" w:before="0"/>
       </w:pPr>
       <w:r>
         <w:rPr>
           <w:rFonts w:ascii="Calibri" w:hAnsi="Calibri" w:eastAsia="Calibri"/>
           <w:b w:val="0"/>
-          <w:i w:val="0"/>
+          <w:i/>
           <w:color w:val="1A2332"/>
           <w:sz w:val="22"/>
         </w:rPr>
-        <w:t>Immediate KPIs: share of wallet %, repeat booking rate, revenue/MT from existing base, top-account retention, complaint closure time.</w:t>
+        <w:t>Immediate KPIs: Share of wallet %, repeat booking rate, revenue/MT from existing base, top-account retention, complaint closure time.</w:t>
       </w:r>
     </w:p>
     <w:p>
@@ -710,12 +1300,12 @@
           <w:color w:val="1B365D"/>
           <w:sz w:val="28"/>
         </w:rPr>
-        <w:t>7. Pillar 5 — Strengthen network and customer engagement where competitors win</w:t>
+        <w:t>8. Pillar 5 — Strengthen network and customer engagement where competitors win</w:t>
       </w:r>
     </w:p>
     <w:p>
       <w:pPr>
-        <w:spacing w:after="120" w:line="276" w:lineRule="auto"/>
+        <w:spacing w:after="120" w:before="0"/>
       </w:pPr>
       <w:r>
         <w:rPr>
@@ -730,15 +1320,15 @@
     </w:p>
     <w:p>
       <w:pPr>
-        <w:spacing w:before="200" w:after="80"/>
+        <w:spacing w:after="120" w:before="0"/>
       </w:pPr>
       <w:r>
         <w:rPr>
           <w:rFonts w:ascii="Calibri" w:hAnsi="Calibri" w:eastAsia="Calibri"/>
           <w:b/>
           <w:i w:val="0"/>
-          <w:color w:val="0F6C8C"/>
-          <w:sz w:val="24"/>
+          <w:color w:val="1A2332"/>
+          <w:sz w:val="22"/>
         </w:rPr>
         <w:t>Actions</w:t>
       </w:r>
@@ -804,23 +1394,22 @@
           <w:color w:val="1A2332"/>
           <w:sz w:val="22"/>
         </w:rPr>
-        <w:t>Align franchise and company branches on common service standards so customer experience does not fragment by ownership model.</w:t>
+        <w:t>Franchise + company branch alignment on common service standards so the customer experience does not fragment by ownership model.</w:t>
       </w:r>
     </w:p>
     <w:p>
       <w:pPr>
-        <w:pStyle w:val="ListBullet"/>
-        <w:spacing w:after="60"/>
+        <w:spacing w:after="120" w:before="0"/>
       </w:pPr>
       <w:r>
         <w:rPr>
           <w:rFonts w:ascii="Calibri" w:hAnsi="Calibri" w:eastAsia="Calibri"/>
           <w:b w:val="0"/>
-          <w:i w:val="0"/>
+          <w:i/>
           <w:color w:val="1A2332"/>
           <w:sz w:val="22"/>
         </w:rPr>
-        <w:t>Immediate KPIs: lane coverage vs plan, booking acceptance rate, lost-quote reasons, competitor win rate on contested lanes.</w:t>
+        <w:t>Immediate KPIs: Lane coverage vs plan, booking acceptance rate, lost-quote reasons, competitor win rate on contested lanes.</w:t>
       </w:r>
     </w:p>
     <w:p>
@@ -835,12 +1424,12 @@
           <w:color w:val="1B365D"/>
           <w:sz w:val="28"/>
         </w:rPr>
-        <w:t>8. Pillar 6 — CRM, visibility and communication discipline</w:t>
+        <w:t>9. Pillar 6 — CRM, visibility and communication discipline</w:t>
       </w:r>
     </w:p>
     <w:p>
       <w:pPr>
-        <w:spacing w:after="120" w:line="276" w:lineRule="auto"/>
+        <w:spacing w:after="120" w:before="0"/>
       </w:pPr>
       <w:r>
         <w:rPr>
@@ -855,15 +1444,15 @@
     </w:p>
     <w:p>
       <w:pPr>
-        <w:spacing w:before="200" w:after="80"/>
+        <w:spacing w:after="120" w:before="0"/>
       </w:pPr>
       <w:r>
         <w:rPr>
           <w:rFonts w:ascii="Calibri" w:hAnsi="Calibri" w:eastAsia="Calibri"/>
           <w:b/>
           <w:i w:val="0"/>
-          <w:color w:val="0F6C8C"/>
-          <w:sz w:val="24"/>
+          <w:color w:val="1A2332"/>
+          <w:sz w:val="22"/>
         </w:rPr>
         <w:t>Actions</w:t>
       </w:r>
@@ -950,18 +1539,17 @@
     </w:p>
     <w:p>
       <w:pPr>
-        <w:pStyle w:val="ListBullet"/>
-        <w:spacing w:after="60"/>
+        <w:spacing w:after="120" w:before="0"/>
       </w:pPr>
       <w:r>
         <w:rPr>
           <w:rFonts w:ascii="Calibri" w:hAnsi="Calibri" w:eastAsia="Calibri"/>
           <w:b w:val="0"/>
-          <w:i w:val="0"/>
+          <w:i/>
           <w:color w:val="1A2332"/>
           <w:sz w:val="22"/>
         </w:rPr>
-        <w:t>Immediate KPIs: lead follow-up compliance, response SLA adherence, POD/LR turnaround, reactivation of silent accounts.</w:t>
+        <w:t>Immediate KPIs: Lead follow-up compliance, response SLA adherence, POD/LR turnaround, reactivation of silent accounts.</w:t>
       </w:r>
     </w:p>
     <w:p>
@@ -976,7 +1564,7 @@
           <w:color w:val="1B365D"/>
           <w:sz w:val="28"/>
         </w:rPr>
-        <w:t>9. Sequencing — practical order of attack</w:t>
+        <w:t>10. 30 / 60 / 90-day execution plan</w:t>
       </w:r>
     </w:p>
     <w:tbl>
@@ -986,26 +1574,18 @@
         <w:tblLook w:firstColumn="1" w:firstRow="1" w:lastColumn="0" w:lastRow="0" w:noHBand="0" w:noVBand="1" w:val="04A0"/>
       </w:tblPr>
       <w:tblGrid>
-        <w:gridCol w:w="3120"/>
-        <w:gridCol w:w="3120"/>
-        <w:gridCol w:w="3120"/>
+        <w:gridCol w:w="3264"/>
+        <w:gridCol w:w="3264"/>
+        <w:gridCol w:w="3264"/>
       </w:tblGrid>
       <w:tr>
         <w:tc>
           <w:tcPr>
-            <w:tcW w:type="dxa" w:w="3120"/>
+            <w:tcW w:type="dxa" w:w="3264"/>
             <w:shd w:fill="1B365D" w:val="clear"/>
           </w:tcPr>
           <w:p>
-            <w:r>
-              <w:rPr>
-                <w:rFonts w:ascii="Calibri" w:hAnsi="Calibri" w:eastAsia="Calibri"/>
-                <w:b/>
-                <w:i w:val="0"/>
-                <w:color w:val="FFFFFF"/>
-                <w:sz w:val="20"/>
-              </w:rPr>
-            </w:r>
+            <w:r/>
             <w:r>
               <w:rPr>
                 <w:rFonts w:ascii="Calibri" w:hAnsi="Calibri" w:eastAsia="Calibri"/>
@@ -1020,10 +1600,11 @@
         </w:tc>
         <w:tc>
           <w:tcPr>
-            <w:tcW w:type="dxa" w:w="3120"/>
+            <w:tcW w:type="dxa" w:w="3264"/>
             <w:shd w:fill="1B365D" w:val="clear"/>
           </w:tcPr>
           <w:p>
+            <w:r/>
             <w:r>
               <w:rPr>
                 <w:rFonts w:ascii="Calibri" w:hAnsi="Calibri" w:eastAsia="Calibri"/>
@@ -1032,7 +1613,268 @@
                 <w:color w:val="FFFFFF"/>
                 <w:sz w:val="20"/>
               </w:rPr>
+              <w:t>Must complete</w:t>
             </w:r>
+          </w:p>
+        </w:tc>
+        <w:tc>
+          <w:tcPr>
+            <w:tcW w:type="dxa" w:w="3264"/>
+            <w:shd w:fill="1B365D" w:val="clear"/>
+          </w:tcPr>
+          <w:p>
+            <w:r/>
+            <w:r>
+              <w:rPr>
+                <w:rFonts w:ascii="Calibri" w:hAnsi="Calibri" w:eastAsia="Calibri"/>
+                <w:b/>
+                <w:i w:val="0"/>
+                <w:color w:val="FFFFFF"/>
+                <w:sz w:val="20"/>
+              </w:rPr>
+              <w:t>Exit criteria</w:t>
+            </w:r>
+          </w:p>
+        </w:tc>
+      </w:tr>
+      <w:tr>
+        <w:tc>
+          <w:tcPr>
+            <w:tcW w:type="dxa" w:w="3264"/>
+          </w:tcPr>
+          <w:p>
+            <w:r/>
+            <w:r>
+              <w:rPr>
+                <w:rFonts w:ascii="Calibri" w:hAnsi="Calibri" w:eastAsia="Calibri"/>
+                <w:b w:val="0"/>
+                <w:i w:val="0"/>
+                <w:color w:val="1A2332"/>
+                <w:sz w:val="20"/>
+              </w:rPr>
+              <w:t>0–30 days</w:t>
+            </w:r>
+          </w:p>
+        </w:tc>
+        <w:tc>
+          <w:tcPr>
+            <w:tcW w:type="dxa" w:w="3264"/>
+          </w:tcPr>
+          <w:p>
+            <w:r/>
+            <w:r>
+              <w:rPr>
+                <w:rFonts w:ascii="Calibri" w:hAnsi="Calibri" w:eastAsia="Calibri"/>
+                <w:b w:val="0"/>
+                <w:i w:val="0"/>
+                <w:color w:val="1A2332"/>
+                <w:sz w:val="20"/>
+              </w:rPr>
+              <w:t>OTD/TAT baseline by priority lane; sales-hour ring-fence live; PTL vs FTL scorecard split; CRM visit logging mandatory; top-account SOW map started; POD/LR response SLA published</w:t>
+            </w:r>
+          </w:p>
+        </w:tc>
+        <w:tc>
+          <w:tcPr>
+            <w:tcW w:type="dxa" w:w="3264"/>
+          </w:tcPr>
+          <w:p>
+            <w:r/>
+            <w:r>
+              <w:rPr>
+                <w:rFonts w:ascii="Calibri" w:hAnsi="Calibri" w:eastAsia="Calibri"/>
+                <w:b w:val="0"/>
+                <w:i w:val="0"/>
+                <w:color w:val="1A2332"/>
+                <w:sz w:val="20"/>
+              </w:rPr>
+              <w:t>Leadership can see OTD, PTL MT and sales hours weekly without debate</w:t>
+            </w:r>
+          </w:p>
+        </w:tc>
+      </w:tr>
+      <w:tr>
+        <w:tc>
+          <w:tcPr>
+            <w:tcW w:type="dxa" w:w="3264"/>
+          </w:tcPr>
+          <w:p>
+            <w:r/>
+            <w:r>
+              <w:rPr>
+                <w:rFonts w:ascii="Calibri" w:hAnsi="Calibri" w:eastAsia="Calibri"/>
+                <w:b w:val="0"/>
+                <w:i w:val="0"/>
+                <w:color w:val="1A2332"/>
+                <w:sz w:val="20"/>
+              </w:rPr>
+              <w:t>31–60 days</w:t>
+            </w:r>
+          </w:p>
+        </w:tc>
+        <w:tc>
+          <w:tcPr>
+            <w:tcW w:type="dxa" w:w="3264"/>
+          </w:tcPr>
+          <w:p>
+            <w:r/>
+            <w:r>
+              <w:rPr>
+                <w:rFonts w:ascii="Calibri" w:hAnsi="Calibri" w:eastAsia="Calibri"/>
+                <w:b w:val="0"/>
+                <w:i w:val="0"/>
+                <w:color w:val="1A2332"/>
+                <w:sz w:val="20"/>
+              </w:rPr>
+              <w:t>Priority-lane cut-offs and hub SLAs enforced; warehouse segregation ownership named; top 20–30 accounts/branch have growth plans; BIC cadence running; trial-to-contract hand-hold live on new logos</w:t>
+            </w:r>
+          </w:p>
+        </w:tc>
+        <w:tc>
+          <w:tcPr>
+            <w:tcW w:type="dxa" w:w="3264"/>
+          </w:tcPr>
+          <w:p>
+            <w:r/>
+            <w:r>
+              <w:rPr>
+                <w:rFonts w:ascii="Calibri" w:hAnsi="Calibri" w:eastAsia="Calibri"/>
+                <w:b w:val="0"/>
+                <w:i w:val="0"/>
+                <w:color w:val="1A2332"/>
+                <w:sz w:val="20"/>
+              </w:rPr>
+              <w:t>OTD moving up the ladder; SOW plans in motion; visit→trial conversion tracked</w:t>
+            </w:r>
+          </w:p>
+        </w:tc>
+      </w:tr>
+      <w:tr>
+        <w:tc>
+          <w:tcPr>
+            <w:tcW w:type="dxa" w:w="3264"/>
+          </w:tcPr>
+          <w:p>
+            <w:r/>
+            <w:r>
+              <w:rPr>
+                <w:rFonts w:ascii="Calibri" w:hAnsi="Calibri" w:eastAsia="Calibri"/>
+                <w:b w:val="0"/>
+                <w:i w:val="0"/>
+                <w:color w:val="1A2332"/>
+                <w:sz w:val="20"/>
+              </w:rPr>
+              <w:t>61–90 days</w:t>
+            </w:r>
+          </w:p>
+        </w:tc>
+        <w:tc>
+          <w:tcPr>
+            <w:tcW w:type="dxa" w:w="3264"/>
+          </w:tcPr>
+          <w:p>
+            <w:r/>
+            <w:r>
+              <w:rPr>
+                <w:rFonts w:ascii="Calibri" w:hAnsi="Calibri" w:eastAsia="Calibri"/>
+                <w:b w:val="0"/>
+                <w:i w:val="0"/>
+                <w:color w:val="1A2332"/>
+                <w:sz w:val="20"/>
+              </w:rPr>
+              <w:t>Named prospect universe live at every branch; funnel review institutionalised; selective network densification on contested lanes; franchise sales/ops rule audited; reach gap vs ACPL/VRL measured</w:t>
+            </w:r>
+          </w:p>
+        </w:tc>
+        <w:tc>
+          <w:tcPr>
+            <w:tcW w:type="dxa" w:w="3264"/>
+          </w:tcPr>
+          <w:p>
+            <w:r/>
+            <w:r>
+              <w:rPr>
+                <w:rFonts w:ascii="Calibri" w:hAnsi="Calibri" w:eastAsia="Calibri"/>
+                <w:b w:val="0"/>
+                <w:i w:val="0"/>
+                <w:color w:val="1A2332"/>
+                <w:sz w:val="20"/>
+              </w:rPr>
+              <w:t>PTL growth visible independent of FTL; conversion and reach improving on priority clusters</w:t>
+            </w:r>
+          </w:p>
+        </w:tc>
+      </w:tr>
+    </w:tbl>
+    <w:p/>
+    <w:p>
+      <w:pPr>
+        <w:spacing w:after="120" w:before="0"/>
+      </w:pPr>
+      <w:r>
+        <w:rPr>
+          <w:rFonts w:ascii="Calibri" w:hAnsi="Calibri" w:eastAsia="Calibri"/>
+          <w:b/>
+          <w:i w:val="0"/>
+          <w:color w:val="1A2332"/>
+          <w:sz w:val="22"/>
+        </w:rPr>
+        <w:t>Do not scale aggressive new acquisition on lanes where OTD remains far below promise; that creates churn and brand damage.</w:t>
+      </w:r>
+    </w:p>
+    <w:p>
+      <w:pPr>
+        <w:spacing w:before="280" w:after="120"/>
+      </w:pPr>
+      <w:r>
+        <w:rPr>
+          <w:rFonts w:ascii="Calibri" w:hAnsi="Calibri" w:eastAsia="Calibri"/>
+          <w:b/>
+          <w:i w:val="0"/>
+          <w:color w:val="1B365D"/>
+          <w:sz w:val="28"/>
+        </w:rPr>
+        <w:t>11. Sequencing (order of attack)</w:t>
+      </w:r>
+    </w:p>
+    <w:tbl>
+      <w:tblPr>
+        <w:tblStyle w:val="TableGrid"/>
+        <w:tblW w:type="auto" w:w="0"/>
+        <w:tblLook w:firstColumn="1" w:firstRow="1" w:lastColumn="0" w:lastRow="0" w:noHBand="0" w:noVBand="1" w:val="04A0"/>
+      </w:tblPr>
+      <w:tblGrid>
+        <w:gridCol w:w="3264"/>
+        <w:gridCol w:w="3264"/>
+        <w:gridCol w:w="3264"/>
+      </w:tblGrid>
+      <w:tr>
+        <w:tc>
+          <w:tcPr>
+            <w:tcW w:type="dxa" w:w="3264"/>
+            <w:shd w:fill="1B365D" w:val="clear"/>
+          </w:tcPr>
+          <w:p>
+            <w:r/>
+            <w:r>
+              <w:rPr>
+                <w:rFonts w:ascii="Calibri" w:hAnsi="Calibri" w:eastAsia="Calibri"/>
+                <w:b/>
+                <w:i w:val="0"/>
+                <w:color w:val="FFFFFF"/>
+                <w:sz w:val="20"/>
+              </w:rPr>
+              <w:t>Wave</w:t>
+            </w:r>
+          </w:p>
+        </w:tc>
+        <w:tc>
+          <w:tcPr>
+            <w:tcW w:type="dxa" w:w="3264"/>
+            <w:shd w:fill="1B365D" w:val="clear"/>
+          </w:tcPr>
+          <w:p>
+            <w:r/>
             <w:r>
               <w:rPr>
                 <w:rFonts w:ascii="Calibri" w:hAnsi="Calibri" w:eastAsia="Calibri"/>
@@ -1047,10 +1889,11 @@
         </w:tc>
         <w:tc>
           <w:tcPr>
-            <w:tcW w:type="dxa" w:w="3120"/>
+            <w:tcW w:type="dxa" w:w="3264"/>
             <w:shd w:fill="1B365D" w:val="clear"/>
           </w:tcPr>
           <w:p>
+            <w:r/>
             <w:r>
               <w:rPr>
                 <w:rFonts w:ascii="Calibri" w:hAnsi="Calibri" w:eastAsia="Calibri"/>
@@ -1059,16 +1902,7 @@
                 <w:color w:val="FFFFFF"/>
                 <w:sz w:val="20"/>
               </w:rPr>
-            </w:r>
-            <w:r>
-              <w:rPr>
-                <w:rFonts w:ascii="Calibri" w:hAnsi="Calibri" w:eastAsia="Calibri"/>
-                <w:b/>
-                <w:i w:val="0"/>
-                <w:color w:val="FFFFFF"/>
-                <w:sz w:val="20"/>
-              </w:rPr>
-              <w:t>Why first</w:t>
+              <w:t>Why</w:t>
             </w:r>
           </w:p>
         </w:tc>
@@ -1076,7 +1910,7 @@
       <w:tr>
         <w:tc>
           <w:tcPr>
-            <w:tcW w:type="dxa" w:w="3120"/>
+            <w:tcW w:type="dxa" w:w="3264"/>
           </w:tcPr>
           <w:p>
             <w:r/>
@@ -1094,7 +1928,7 @@
         </w:tc>
         <w:tc>
           <w:tcPr>
-            <w:tcW w:type="dxa" w:w="3120"/>
+            <w:tcW w:type="dxa" w:w="3264"/>
           </w:tcPr>
           <w:p>
             <w:r/>
@@ -1112,7 +1946,7 @@
         </w:tc>
         <w:tc>
           <w:tcPr>
-            <w:tcW w:type="dxa" w:w="3120"/>
+            <w:tcW w:type="dxa" w:w="3264"/>
           </w:tcPr>
           <w:p>
             <w:r/>
@@ -1124,7 +1958,7 @@
                 <w:color w:val="1A2332"/>
                 <w:sz w:val="20"/>
               </w:rPr>
-              <w:t>Stops leakage from current base and makes promises believable</w:t>
+              <w:t>Stops leakage from the current base and makes market promises believable</w:t>
             </w:r>
           </w:p>
         </w:tc>
@@ -1132,7 +1966,7 @@
       <w:tr>
         <w:tc>
           <w:tcPr>
-            <w:tcW w:type="dxa" w:w="3120"/>
+            <w:tcW w:type="dxa" w:w="3264"/>
           </w:tcPr>
           <w:p>
             <w:r/>
@@ -1150,7 +1984,7 @@
         </w:tc>
         <w:tc>
           <w:tcPr>
-            <w:tcW w:type="dxa" w:w="3120"/>
+            <w:tcW w:type="dxa" w:w="3264"/>
           </w:tcPr>
           <w:p>
             <w:r/>
@@ -1168,7 +2002,7 @@
         </w:tc>
         <w:tc>
           <w:tcPr>
-            <w:tcW w:type="dxa" w:w="3120"/>
+            <w:tcW w:type="dxa" w:w="3264"/>
           </w:tcPr>
           <w:p>
             <w:r/>
@@ -1188,7 +2022,7 @@
       <w:tr>
         <w:tc>
           <w:tcPr>
-            <w:tcW w:type="dxa" w:w="3120"/>
+            <w:tcW w:type="dxa" w:w="3264"/>
           </w:tcPr>
           <w:p>
             <w:r/>
@@ -1206,7 +2040,7 @@
         </w:tc>
         <w:tc>
           <w:tcPr>
-            <w:tcW w:type="dxa" w:w="3120"/>
+            <w:tcW w:type="dxa" w:w="3264"/>
           </w:tcPr>
           <w:p>
             <w:r/>
@@ -1224,7 +2058,7 @@
         </w:tc>
         <w:tc>
           <w:tcPr>
-            <w:tcW w:type="dxa" w:w="3120"/>
+            <w:tcW w:type="dxa" w:w="3264"/>
           </w:tcPr>
           <w:p>
             <w:r/>
@@ -1245,8 +2079,34 @@
     <w:p/>
     <w:p>
       <w:pPr>
-        <w:spacing w:after="120" w:line="276" w:lineRule="auto"/>
+        <w:spacing w:before="280" w:after="120"/>
       </w:pPr>
+      <w:r>
+        <w:rPr>
+          <w:rFonts w:ascii="Calibri" w:hAnsi="Calibri" w:eastAsia="Calibri"/>
+          <w:b/>
+          <w:i w:val="0"/>
+          <w:color w:val="1B365D"/>
+          <w:sz w:val="28"/>
+        </w:rPr>
+        <w:t>12. Operating rhythm</w:t>
+      </w:r>
+    </w:p>
+    <w:p>
+      <w:pPr>
+        <w:pStyle w:val="ListBullet"/>
+        <w:spacing w:after="60"/>
+      </w:pPr>
+      <w:r>
+        <w:rPr>
+          <w:rFonts w:ascii="Calibri" w:hAnsi="Calibri" w:eastAsia="Calibri"/>
+          <w:b/>
+          <w:i w:val="0"/>
+          <w:color w:val="1A2332"/>
+          <w:sz w:val="22"/>
+        </w:rPr>
+        <w:t xml:space="preserve">Daily (branch): </w:t>
+      </w:r>
       <w:r>
         <w:rPr>
           <w:rFonts w:ascii="Calibri" w:hAnsi="Calibri" w:eastAsia="Calibri"/>
@@ -1255,7 +2115,59 @@
           <w:color w:val="1A2332"/>
           <w:sz w:val="22"/>
         </w:rPr>
-        <w:t>Do not scale aggressive new acquisition on lanes where OTD remains far below promise; that creates churn and brand damage.</w:t>
+        <w:t>OTD/holding exceptions; sales visit plan vs actual; open customer issues.</w:t>
+      </w:r>
+    </w:p>
+    <w:p>
+      <w:pPr>
+        <w:pStyle w:val="ListBullet"/>
+        <w:spacing w:after="60"/>
+      </w:pPr>
+      <w:r>
+        <w:rPr>
+          <w:rFonts w:ascii="Calibri" w:hAnsi="Calibri" w:eastAsia="Calibri"/>
+          <w:b/>
+          <w:i w:val="0"/>
+          <w:color w:val="1A2332"/>
+          <w:sz w:val="22"/>
+        </w:rPr>
+        <w:t xml:space="preserve">Weekly (cluster/region): </w:t>
+      </w:r>
+      <w:r>
+        <w:rPr>
+          <w:rFonts w:ascii="Calibri" w:hAnsi="Calibri" w:eastAsia="Calibri"/>
+          <w:b w:val="0"/>
+          <w:i w:val="0"/>
+          <w:color w:val="1A2332"/>
+          <w:sz w:val="22"/>
+        </w:rPr>
+        <w:t>PTL vs FTL vs target; funnel conversion; top-account share-of-wallet moves; competitor losses.</w:t>
+      </w:r>
+    </w:p>
+    <w:p>
+      <w:pPr>
+        <w:pStyle w:val="ListBullet"/>
+        <w:spacing w:after="60"/>
+      </w:pPr>
+      <w:r>
+        <w:rPr>
+          <w:rFonts w:ascii="Calibri" w:hAnsi="Calibri" w:eastAsia="Calibri"/>
+          <w:b/>
+          <w:i w:val="0"/>
+          <w:color w:val="1A2332"/>
+          <w:sz w:val="22"/>
+        </w:rPr>
+        <w:t xml:space="preserve">Monthly (leadership): </w:t>
+      </w:r>
+      <w:r>
+        <w:rPr>
+          <w:rFonts w:ascii="Calibri" w:hAnsi="Calibri" w:eastAsia="Calibri"/>
+          <w:b w:val="0"/>
+          <w:i w:val="0"/>
+          <w:color w:val="1A2332"/>
+          <w:sz w:val="22"/>
+        </w:rPr>
+        <w:t>Organised market-share trajectory, reach gap vs ACPL/VRL, OTD vs 85% path, franchise compliance to sales/ops separation.</w:t>
       </w:r>
     </w:p>
     <w:p>
@@ -1270,70 +2182,7 @@
           <w:color w:val="1B365D"/>
           <w:sz w:val="28"/>
         </w:rPr>
-        <w:t>10. Operating rhythm</w:t>
-      </w:r>
-    </w:p>
-    <w:p>
-      <w:pPr>
-        <w:pStyle w:val="ListBullet"/>
-        <w:spacing w:after="60"/>
-      </w:pPr>
-      <w:r>
-        <w:rPr>
-          <w:rFonts w:ascii="Calibri" w:hAnsi="Calibri" w:eastAsia="Calibri"/>
-          <w:b w:val="0"/>
-          <w:i w:val="0"/>
-          <w:color w:val="1A2332"/>
-          <w:sz w:val="22"/>
-        </w:rPr>
-        <w:t>Daily (branch): OTD/holding exceptions; sales visit plan vs actual; open customer issues.</w:t>
-      </w:r>
-    </w:p>
-    <w:p>
-      <w:pPr>
-        <w:pStyle w:val="ListBullet"/>
-        <w:spacing w:after="60"/>
-      </w:pPr>
-      <w:r>
-        <w:rPr>
-          <w:rFonts w:ascii="Calibri" w:hAnsi="Calibri" w:eastAsia="Calibri"/>
-          <w:b w:val="0"/>
-          <w:i w:val="0"/>
-          <w:color w:val="1A2332"/>
-          <w:sz w:val="22"/>
-        </w:rPr>
-        <w:t>Weekly (cluster/region): PTL vs FTL vs target; funnel conversion; top-account share-of-wallet moves; competitor losses.</w:t>
-      </w:r>
-    </w:p>
-    <w:p>
-      <w:pPr>
-        <w:pStyle w:val="ListBullet"/>
-        <w:spacing w:after="60"/>
-      </w:pPr>
-      <w:r>
-        <w:rPr>
-          <w:rFonts w:ascii="Calibri" w:hAnsi="Calibri" w:eastAsia="Calibri"/>
-          <w:b w:val="0"/>
-          <w:i w:val="0"/>
-          <w:color w:val="1A2332"/>
-          <w:sz w:val="22"/>
-        </w:rPr>
-        <w:t>Monthly (leadership): organised market-share trajectory, reach gap vs ACPL/VRL, OTD vs 85% path, franchise compliance to sales/ops separation.</w:t>
-      </w:r>
-    </w:p>
-    <w:p>
-      <w:pPr>
-        <w:spacing w:before="280" w:after="120"/>
-      </w:pPr>
-      <w:r>
-        <w:rPr>
-          <w:rFonts w:ascii="Calibri" w:hAnsi="Calibri" w:eastAsia="Calibri"/>
-          <w:b/>
-          <w:i w:val="0"/>
-          <w:color w:val="1B365D"/>
-          <w:sz w:val="28"/>
-        </w:rPr>
-        <w:t>11. Leadership scorecard</w:t>
+        <w:t>13. Leadership scorecard</w:t>
       </w:r>
     </w:p>
     <w:tbl>
@@ -1343,26 +2192,18 @@
         <w:tblLook w:firstColumn="1" w:firstRow="1" w:lastColumn="0" w:lastRow="0" w:noHBand="0" w:noVBand="1" w:val="04A0"/>
       </w:tblPr>
       <w:tblGrid>
-        <w:gridCol w:w="3120"/>
-        <w:gridCol w:w="3120"/>
-        <w:gridCol w:w="3120"/>
+        <w:gridCol w:w="3264"/>
+        <w:gridCol w:w="3264"/>
+        <w:gridCol w:w="3264"/>
       </w:tblGrid>
       <w:tr>
         <w:tc>
           <w:tcPr>
-            <w:tcW w:type="dxa" w:w="3120"/>
+            <w:tcW w:type="dxa" w:w="3264"/>
             <w:shd w:fill="1B365D" w:val="clear"/>
           </w:tcPr>
           <w:p>
-            <w:r>
-              <w:rPr>
-                <w:rFonts w:ascii="Calibri" w:hAnsi="Calibri" w:eastAsia="Calibri"/>
-                <w:b/>
-                <w:i w:val="0"/>
-                <w:color w:val="FFFFFF"/>
-                <w:sz w:val="20"/>
-              </w:rPr>
-            </w:r>
+            <w:r/>
             <w:r>
               <w:rPr>
                 <w:rFonts w:ascii="Calibri" w:hAnsi="Calibri" w:eastAsia="Calibri"/>
@@ -1377,19 +2218,11 @@
         </w:tc>
         <w:tc>
           <w:tcPr>
-            <w:tcW w:type="dxa" w:w="3120"/>
+            <w:tcW w:type="dxa" w:w="3264"/>
             <w:shd w:fill="1B365D" w:val="clear"/>
           </w:tcPr>
           <w:p>
-            <w:r>
-              <w:rPr>
-                <w:rFonts w:ascii="Calibri" w:hAnsi="Calibri" w:eastAsia="Calibri"/>
-                <w:b/>
-                <w:i w:val="0"/>
-                <w:color w:val="FFFFFF"/>
-                <w:sz w:val="20"/>
-              </w:rPr>
-            </w:r>
+            <w:r/>
             <w:r>
               <w:rPr>
                 <w:rFonts w:ascii="Calibri" w:hAnsi="Calibri" w:eastAsia="Calibri"/>
@@ -1404,19 +2237,11 @@
         </w:tc>
         <w:tc>
           <w:tcPr>
-            <w:tcW w:type="dxa" w:w="3120"/>
+            <w:tcW w:type="dxa" w:w="3264"/>
             <w:shd w:fill="1B365D" w:val="clear"/>
           </w:tcPr>
           <w:p>
-            <w:r>
-              <w:rPr>
-                <w:rFonts w:ascii="Calibri" w:hAnsi="Calibri" w:eastAsia="Calibri"/>
-                <w:b/>
-                <w:i w:val="0"/>
-                <w:color w:val="FFFFFF"/>
-                <w:sz w:val="20"/>
-              </w:rPr>
-            </w:r>
+            <w:r/>
             <w:r>
               <w:rPr>
                 <w:rFonts w:ascii="Calibri" w:hAnsi="Calibri" w:eastAsia="Calibri"/>
@@ -1433,7 +2258,7 @@
       <w:tr>
         <w:tc>
           <w:tcPr>
-            <w:tcW w:type="dxa" w:w="3120"/>
+            <w:tcW w:type="dxa" w:w="3264"/>
           </w:tcPr>
           <w:p>
             <w:r/>
@@ -1451,7 +2276,7 @@
         </w:tc>
         <w:tc>
           <w:tcPr>
-            <w:tcW w:type="dxa" w:w="3120"/>
+            <w:tcW w:type="dxa" w:w="3264"/>
           </w:tcPr>
           <w:p>
             <w:r/>
@@ -1469,7 +2294,7 @@
         </w:tc>
         <w:tc>
           <w:tcPr>
-            <w:tcW w:type="dxa" w:w="3120"/>
+            <w:tcW w:type="dxa" w:w="3264"/>
           </w:tcPr>
           <w:p>
             <w:r/>
@@ -1489,7 +2314,7 @@
       <w:tr>
         <w:tc>
           <w:tcPr>
-            <w:tcW w:type="dxa" w:w="3120"/>
+            <w:tcW w:type="dxa" w:w="3264"/>
           </w:tcPr>
           <w:p>
             <w:r/>
@@ -1507,7 +2332,7 @@
         </w:tc>
         <w:tc>
           <w:tcPr>
-            <w:tcW w:type="dxa" w:w="3120"/>
+            <w:tcW w:type="dxa" w:w="3264"/>
           </w:tcPr>
           <w:p>
             <w:r/>
@@ -1525,7 +2350,7 @@
         </w:tc>
         <w:tc>
           <w:tcPr>
-            <w:tcW w:type="dxa" w:w="3120"/>
+            <w:tcW w:type="dxa" w:w="3264"/>
           </w:tcPr>
           <w:p>
             <w:r/>
@@ -1545,7 +2370,7 @@
       <w:tr>
         <w:tc>
           <w:tcPr>
-            <w:tcW w:type="dxa" w:w="3120"/>
+            <w:tcW w:type="dxa" w:w="3264"/>
           </w:tcPr>
           <w:p>
             <w:r/>
@@ -1563,7 +2388,7 @@
         </w:tc>
         <w:tc>
           <w:tcPr>
-            <w:tcW w:type="dxa" w:w="3120"/>
+            <w:tcW w:type="dxa" w:w="3264"/>
           </w:tcPr>
           <w:p>
             <w:r/>
@@ -1581,7 +2406,7 @@
         </w:tc>
         <w:tc>
           <w:tcPr>
-            <w:tcW w:type="dxa" w:w="3120"/>
+            <w:tcW w:type="dxa" w:w="3264"/>
           </w:tcPr>
           <w:p>
             <w:r/>
@@ -1601,7 +2426,7 @@
       <w:tr>
         <w:tc>
           <w:tcPr>
-            <w:tcW w:type="dxa" w:w="3120"/>
+            <w:tcW w:type="dxa" w:w="3264"/>
           </w:tcPr>
           <w:p>
             <w:r/>
@@ -1619,7 +2444,7 @@
         </w:tc>
         <w:tc>
           <w:tcPr>
-            <w:tcW w:type="dxa" w:w="3120"/>
+            <w:tcW w:type="dxa" w:w="3264"/>
           </w:tcPr>
           <w:p>
             <w:r/>
@@ -1637,7 +2462,7 @@
         </w:tc>
         <w:tc>
           <w:tcPr>
-            <w:tcW w:type="dxa" w:w="3120"/>
+            <w:tcW w:type="dxa" w:w="3264"/>
           </w:tcPr>
           <w:p>
             <w:r/>
@@ -1657,7 +2482,7 @@
       <w:tr>
         <w:tc>
           <w:tcPr>
-            <w:tcW w:type="dxa" w:w="3120"/>
+            <w:tcW w:type="dxa" w:w="3264"/>
           </w:tcPr>
           <w:p>
             <w:r/>
@@ -1675,7 +2500,7 @@
         </w:tc>
         <w:tc>
           <w:tcPr>
-            <w:tcW w:type="dxa" w:w="3120"/>
+            <w:tcW w:type="dxa" w:w="3264"/>
           </w:tcPr>
           <w:p>
             <w:r/>
@@ -1693,7 +2518,7 @@
         </w:tc>
         <w:tc>
           <w:tcPr>
-            <w:tcW w:type="dxa" w:w="3120"/>
+            <w:tcW w:type="dxa" w:w="3264"/>
           </w:tcPr>
           <w:p>
             <w:r/>
@@ -1713,7 +2538,7 @@
       <w:tr>
         <w:tc>
           <w:tcPr>
-            <w:tcW w:type="dxa" w:w="3120"/>
+            <w:tcW w:type="dxa" w:w="3264"/>
           </w:tcPr>
           <w:p>
             <w:r/>
@@ -1731,7 +2556,7 @@
         </w:tc>
         <w:tc>
           <w:tcPr>
-            <w:tcW w:type="dxa" w:w="3120"/>
+            <w:tcW w:type="dxa" w:w="3264"/>
           </w:tcPr>
           <w:p>
             <w:r/>
@@ -1749,7 +2574,7 @@
         </w:tc>
         <w:tc>
           <w:tcPr>
-            <w:tcW w:type="dxa" w:w="3120"/>
+            <w:tcW w:type="dxa" w:w="3264"/>
           </w:tcPr>
           <w:p>
             <w:r/>
@@ -1780,7 +2605,7 @@
           <w:color w:val="1B365D"/>
           <w:sz w:val="28"/>
         </w:rPr>
-        <w:t>12. Expected impact if executed with discipline</w:t>
+        <w:t>14. Expected impact if executed with discipline</w:t>
       </w:r>
     </w:p>
     <w:p>
@@ -1891,16 +2716,19 @@
           <w:color w:val="1B365D"/>
           <w:sz w:val="28"/>
         </w:rPr>
-        <w:t>13. One-line way forward</w:t>
+        <w:t>15. One-line way forward</w:t>
       </w:r>
     </w:p>
     <w:p>
+      <w:pPr>
+        <w:spacing w:after="120" w:before="0"/>
+      </w:pPr>
       <w:r>
         <w:rPr>
           <w:rFonts w:ascii="Calibri" w:hAnsi="Calibri" w:eastAsia="Calibri"/>
           <w:b/>
           <w:i w:val="0"/>
-          <w:color w:val="1B365D"/>
+          <w:color w:val="1A2332"/>
           <w:sz w:val="22"/>
         </w:rPr>
         <w:t>Make PTL reliable, free salespeople to sell, convert more of what you already touch, deepen every existing account, and densify the network where competitors currently win—while scoring PTL on its own, not through FTL.</w:t>
@@ -1908,7 +2736,7 @@
     </w:p>
     <w:sectPr>
       <w:pgSz w:w="12240" w:h="15840"/>
-      <w:pgMar w:top="1224" w:right="1440" w:bottom="1224" w:left="1440" w:header="720" w:footer="720" w:gutter="0"/>
+      <w:pgMar w:top="1008" w:right="1224" w:bottom="1008" w:left="1224" w:header="720" w:footer="720" w:gutter="0"/>
       <w:cols w:space="720"/>
       <w:docGrid w:linePitch="360"/>
     </w:sectPr>

</xml_diff>